<commit_message>
Physics, Actually Vol 1: add Optics as Ch 12 after Light (everyday-voice adaptation), renumber Ch 13-20, update TOC and series plan; backups 20261001-1926
</commit_message>
<xml_diff>
--- a/Science Books/Physics/Volume overview/SERIES PLAN - STATUS.docx
+++ b/Science Books/Physics/Volume overview/SERIES PLAN - STATUS.docx
@@ -30,7 +30,7 @@
           <w:sz w:val="20"/>
           <w:szCs w:val="20"/>
         </w:rPr>
-        <w:t>Reflects the actual contents of four current manuscripts — Physics Vol. 1 (19 chapters + Prologue, complete), Physics Vol. 2 (13 chapters + Prologue, Epilogue, Appendix, and back matter, ~45,400 words — text complete; opener art still needed for Ch. 10–11), The Quantum World (10 chapters + Prologue, Epilogue, and two appendices, finished), and Physics Vol. 3 (14 chapters + Prologue, Epilogue, Appendix, Further Reading, and Bibliography, ~31,500 words — text complete, chapter illustrations still placeholders). Of the 52 chapters in the original series plan, 21 are done inside Vol. 1/Vol. 2, 13 were done as part of The Quantum World instead, 17 are done as part of Vol. 3, and 1 (Optics, #39) is now written as a complete standalone chapter in the Volume overview folder but not yet placed in a volume. On top of that, 6 chapters were written that were never part of the original plan at all (marked "New" below).</w:t>
+        <w:t xml:space="preserve">Reflects the actual contents of four current manuscripts — Physics Vol. 1 (20 chapters + Prologue, complete; Optics added as Ch. 12 on 2026-10-01), Physics Vol. 2 (13 chapters + Prologue, Epilogue, Appendix, and back matter, ~45,400 words — text complete; opener art still needed for Ch. 10–11), The Quantum World (10 chapters + Prologue, Epilogue, and two appendices, finished), and Physics Vol. 3 (14 chapters + Prologue, Epilogue, Appendix, Further Reading, and Bibliography, ~31,500 words — text complete, chapter illustrations still placeholders). Of the 52 chapters in the original series plan, 22 are done inside Vol. 1/Vol. 2, 13 were done as part of The Quantum World instead, 17 are done as part of Vol. 3. The 22 include Optics (#39), now Vol. 1, Ch. 12. On top of that, 6 chapters were written that were never part of the original plan at all (marked "New" below).</w:t>
       </w:r>
     </w:p>
     <w:p>
@@ -64,7 +64,7 @@
     </w:p>
     <w:p>
       <w:r>
-        <w:t>• UPDATED 2026-10-01 — Volume overview source drafts under 1,000 words: these files are the per-plan-item source drafts that fed Vols. 1–3 and The Quantum World, not a separate book. #28, #29, #30, #31, #33, #34, #40–#44 duplicate finished chapters, so each got a red “STATUS — MERGED” note naming the finished chapter and was otherwise left unchanged; nothing was written twice. #39 Optics, the only one with no finished counterpart, was written out as a complete ~3,000-word chapter (refraction and Snell’s law worked, total internal reflection and fiber optics, mirages, rainbows, blue sky, interference with a home experiment, the diffraction limit, the eye, polarization, lasers, further reading with ISBNs). It is ready to slot into Vol. 1 after Ch. 11 Light but was not inserted into the KDP-ready Vol. 1 files.</w:t>
+        <w:t xml:space="preserve">• UPDATED 2026-10-01 — Volume overview source drafts under 1,000 words: these files are the per-plan-item source drafts that fed Vols. 1–3 and The Quantum World, not a separate book. #28, #29, #30, #31, #33, #34, #40–#44 duplicate finished chapters, so each got a red “STATUS — MERGED” note naming the finished chapter and was otherwise left unchanged; nothing was written twice. #39 Optics, the only one with no finished counterpart, was written out as a complete ~3,000-word chapter (refraction and Snell’s law worked, total internal reflection and fiber optics, mirages, rainbows, blue sky, interference with a home experiment, the diffraction limit, the eye, polarization, lasers, further reading with ISBNs). On 2026-10-01 an everyday-voice adaptation (light on maths, Further Reading dropped to match Vol. 1) was spliced into both Vol. 1 KDP files as Ch. 12, after Ch. 11 Light; former Ch. 12–19 are now Ch. 13–20.</w:t>
       </w:r>
     </w:p>
     <w:p>
@@ -1921,7 +1921,7 @@
                 <w:sz w:val="18"/>
                 <w:szCs w:val="18"/>
               </w:rPr>
-              <w:t xml:space="preserve">Vol. 1, Ch. 12</w:t>
+              <w:t xml:space="preserve">Vol. 1, Ch. 13</w:t>
             </w:r>
           </w:p>
         </w:tc>
@@ -2053,7 +2053,7 @@
                 <w:sz w:val="18"/>
                 <w:szCs w:val="18"/>
               </w:rPr>
-              <w:t xml:space="preserve">Vol. 1, Ch. 13</w:t>
+              <w:t xml:space="preserve">Vol. 1, Ch. 14</w:t>
             </w:r>
           </w:p>
         </w:tc>
@@ -2185,7 +2185,7 @@
                 <w:sz w:val="18"/>
                 <w:szCs w:val="18"/>
               </w:rPr>
-              <w:t xml:space="preserve">Vol. 1, Ch. 14</w:t>
+              <w:t xml:space="preserve">Vol. 1, Ch. 15</w:t>
             </w:r>
           </w:p>
         </w:tc>
@@ -2317,7 +2317,7 @@
                 <w:sz w:val="18"/>
                 <w:szCs w:val="18"/>
               </w:rPr>
-              <w:t xml:space="preserve">Vol. 1, Ch. 15</w:t>
+              <w:t xml:space="preserve">Vol. 1, Ch. 16</w:t>
             </w:r>
           </w:p>
         </w:tc>
@@ -2449,7 +2449,7 @@
                 <w:sz w:val="18"/>
                 <w:szCs w:val="18"/>
               </w:rPr>
-              <w:t xml:space="preserve">Vol. 1, Ch. 16</w:t>
+              <w:t xml:space="preserve">Vol. 1, Ch. 17</w:t>
             </w:r>
           </w:p>
         </w:tc>
@@ -2581,7 +2581,7 @@
                 <w:sz w:val="18"/>
                 <w:szCs w:val="18"/>
               </w:rPr>
-              <w:t xml:space="preserve">Vol. 1, Ch. 17</w:t>
+              <w:t xml:space="preserve">Vol. 1, Ch. 18</w:t>
             </w:r>
           </w:p>
         </w:tc>
@@ -2713,7 +2713,7 @@
                 <w:sz w:val="18"/>
                 <w:szCs w:val="18"/>
               </w:rPr>
-              <w:t xml:space="preserve">Vol. 1, Ch. 18</w:t>
+              <w:t xml:space="preserve">Vol. 1, Ch. 19</w:t>
             </w:r>
           </w:p>
         </w:tc>
@@ -2845,7 +2845,7 @@
                 <w:sz w:val="18"/>
                 <w:szCs w:val="18"/>
               </w:rPr>
-              <w:t xml:space="preserve">Vol. 1, Ch. 19</w:t>
+              <w:t xml:space="preserve">Vol. 1, Ch. 20</w:t>
             </w:r>
           </w:p>
         </w:tc>
@@ -8627,7 +8627,7 @@
                 <w:sz w:val="18"/>
                 <w:szCs w:val="18"/>
               </w:rPr>
-              <w:t>WRITTEN — standalone</w:t>
+              <w:t xml:space="preserve">DONE</w:t>
             </w:r>
           </w:p>
         </w:tc>
@@ -8653,7 +8653,7 @@
                 <w:sz w:val="18"/>
                 <w:szCs w:val="18"/>
               </w:rPr>
-              <w:t>Volume overview, 39 - Optics (complete chapter, ~3,000 words)</w:t>
+              <w:t xml:space="preserve">Vol. 1, Ch. 12</w:t>
             </w:r>
           </w:p>
         </w:tc>
@@ -8679,7 +8679,7 @@
                 <w:sz w:val="18"/>
                 <w:szCs w:val="18"/>
               </w:rPr>
-              <w:t>written 2026-10-01; ready to slot into Vol. 1 after Ch. 11 Light; not yet inserted into the KDP-ready Vol. 1 files</w:t>
+              <w:t xml:space="preserve">written 2026-10-01; adapted and spliced into Vol. 1 after Ch. 11 Light on 2026-10-01 (source draft kept in Volume overview)</w:t>
             </w:r>
           </w:p>
         </w:tc>
@@ -8751,7 +8751,7 @@
     </w:p>
     <w:p>
       <w:r>
-        <w:t xml:space="preserve">• Optics (#39) is NOT included in Vol. 3 — classical wave optics doesn’t fit a particle-physics/complexity/speculative arc. Recommended instead as a companion chapter to Vol. 1’s existing Light chapter (Ch. 11).</w:t>
+        <w:t xml:space="preserve">• Optics (#39) is NOT included in Vol. 3 — classical wave optics doesn’t fit a particle-physics/complexity/speculative arc. Placed in Vol. 1 as Ch. 12, right after the Light chapter (Ch. 11).</w:t>
       </w:r>
     </w:p>
     <w:p>

</xml_diff>